<commit_message>
Update YC application answers regarding product progress and tech stack
Update PagoYa YC application document with revised answers for "how far along are you" and "tech stack" sections.

Replit-Commit-Author: Agent
Replit-Commit-Session-Id: cabc721f-c66c-4670-ad9f-a3c7bf5dd0cd
Replit-Commit-Checkpoint-Type: full_checkpoint
Replit-Commit-Event-Id: 6887b633-e0f5-439d-a4df-f3294bff40a2
Replit-Commit-Screenshot-Url: https://storage.googleapis.com/screenshot-production-us-central1/86cae774-c82e-441c-9e1e-162b1f174041/cabc721f-c66c-4670-ad9f-a3c7bf5dd0cd/FCMVftj
Replit-Helium-Checkpoint-Created: true
</commit_message>
<xml_diff>
--- a/PagoYa_YC_Application.docx
+++ b/PagoYa_YC_Application.docx
@@ -106,7 +106,7 @@
           <w:sz w:val="22"/>
           <w:szCs w:val="22"/>
         </w:rPr>
-        <w:t xml:space="preserve">Integrates two Mexican providers (SIPREL + Evoluciona) with automatic failover. 20+ billers, $15 MXN flat fee per transaction.</w:t>
+        <w:t>Integrates two Mexican providers (SIPREL + Evoluciona) with automatic failover. 20+ billers, $25 MXN flat fee per transaction.</w:t>
       </w:r>
     </w:p>
     <w:p>
@@ -210,7 +210,7 @@
           <w:sz w:val="22"/>
           <w:szCs w:val="22"/>
         </w:rPr>
-        <w:t xml:space="preserve">Users earn points on every payment (1 pt / $10 MXN, tier multipliers at Bronze / Silver / Gold). Fully functional redemption: wallet credit (MXN deposited directly) or a free-transaction token that waives the $15 MXN fee on the next payment. Token is enforced atomically inside the payment DB transaction — it cannot be consumed without the payment succeeding.</w:t>
+        <w:t>Users earn points on every payment (1 pt / $10 MXN, tier multipliers at Bronze / Silver / Gold). Fully functional redemption: wallet credit (MXN deposited directly) or a free-transaction token that waives the $25 MXN fee on the next payment. Token is enforced atomically inside the payment DB transaction — it cannot be consumed without the payment succeeding.</w:t>
       </w:r>
     </w:p>
     <w:p>
@@ -329,6 +329,36 @@
           <w:sz w:val="22"/>
           <w:szCs w:val="22"/>
         </w:rPr>
+        <w:t>KYC — Nivel 2 identity verification: CURP-based verification flow against RENAPO. Verified users unlock a $24,000 MXN/month wallet limit (vs. $6,000 unverified). Architected for Metamap/Truora API plug-in; direct RENAPO access available post-SAT entity registration for lower cost at scale.</w:t>
+      </w:r>
+    </w:p>
+    <w:p>
+      <w:pPr>
+        <w:spacing w:after="120" w:before="200"/>
+      </w:pPr>
+      <w:r>
+        <w:rPr>
+          <w:b/>
+          <w:bCs/>
+          <w:color w:val="0A2540"/>
+          <w:sz w:val="22"/>
+          <w:szCs w:val="22"/>
+        </w:rPr>
+        <w:t>P2P wallet transfers: Users send MXN directly to any Mexican mobile number. Recipients without an account get an auto-created wallet and a WhatsApp invite — turning every transfer into an acquisition event. Daily limits enforced. Atomic debit/credit in a single DB transaction.</w:t>
+      </w:r>
+    </w:p>
+    <w:p>
+      <w:pPr>
+        <w:spacing w:after="120" w:before="200"/>
+      </w:pPr>
+      <w:r>
+        <w:rPr>
+          <w:b/>
+          <w:bCs/>
+          <w:color w:val="0A2540"/>
+          <w:sz w:val="22"/>
+          <w:szCs w:val="22"/>
+        </w:rPr>
         <w:t xml:space="preserve">What is in progress:</w:t>
       </w:r>
     </w:p>
@@ -375,13 +405,6 @@
         </w:numPr>
         <w:spacing w:after="100"/>
       </w:pPr>
-      <w:r>
-        <w:rPr>
-          <w:sz w:val="22"/>
-          <w:szCs w:val="22"/>
-        </w:rPr>
-        <w:t xml:space="preserve">KYC / identity verification for higher wallet limits under CNBV guidelines</w:t>
-      </w:r>
     </w:p>
     <w:p>
       <w:pPr>
@@ -561,7 +584,7 @@
                 <w:sz w:val="20"/>
                 <w:szCs w:val="20"/>
               </w:rPr>
-              <w:t xml:space="preserve">React 18 + Vite, TypeScript, Wouter (client-side routing), Tailwind CSS + inline styles. Mobile-first, PWA-ready. No React Native — fully responsive and installable on iOS/Android.</w:t>
+              <w:t>React 19 + Vite, TypeScript, Wouter (client-side routing), Tailwind CSS + inline styles. Mobile-first, PWA-ready. No React Native — fully responsive and installable on iOS/Android.</w:t>
             </w:r>
           </w:p>
         </w:tc>
@@ -796,7 +819,7 @@
                 <w:sz w:val="20"/>
                 <w:szCs w:val="20"/>
               </w:rPr>
-              <w:t xml:space="preserve">Replit Agent (Claude). The entire product was built using Replit Agent as the primary development tool. Zero external developers. Complete loyalty system, payment integrations, and all backend routes built and tested in collaborative AI sessions.</w:t>
+              <w:t>Replit Agent (Claude). The entire product — bill payment engine, wallet, loyalty system, P2P transfers, KYC/CURP verification, and all API routes — was built using Replit Agent as the primary development tool. Zero external developers. Schema migrations, multi-provider payment failover, atomic DB transactions, and 70+ integration tests all written and iterated in AI-driven sessions.</w:t>
             </w:r>
           </w:p>
         </w:tc>

</xml_diff>

<commit_message>
Update application status and technology details for PagoYa
Modify PagoYa_YC_Application.docx to reflect updated fee structure, shipped features (KYC Nivel 2, P2P transfers), and tech stack versions.

Replit-Commit-Author: Agent
Replit-Commit-Session-Id: cabc721f-c66c-4670-ad9f-a3c7bf5dd0cd
Replit-Commit-Checkpoint-Type: full_checkpoint
Replit-Commit-Event-Id: 35fb00b2-00a3-4d78-8ee4-13ec909467ba
Replit-Commit-Screenshot-Url: https://storage.googleapis.com/screenshot-production-us-central1/86cae774-c82e-441c-9e1e-162b1f174041/cabc721f-c66c-4670-ad9f-a3c7bf5dd0cd/FCMVftj
Replit-Helium-Checkpoint-Created: true
</commit_message>
<xml_diff>
--- a/PagoYa_YC_Application.docx
+++ b/PagoYa_YC_Application.docx
@@ -319,6 +319,44 @@
     </w:p>
     <w:p>
       <w:pPr>
+        <w:pStyle w:val="ListParagraph"/>
+        <w:numPr>
+          <w:ilvl w:val="0"/>
+          <w:numId w:val="1"/>
+        </w:numPr>
+        <w:spacing w:after="120"/>
+      </w:pPr>
+      <w:r>
+        <w:rPr>
+          <w:b/>
+          <w:bCs/>
+          <w:sz w:val="22"/>
+          <w:szCs w:val="22"/>
+        </w:rPr>
+        <w:t xml:space="preserve">P2P wallet transfers: Users send MXN directly to any Mexican mobile number. Recipients without an account get an auto-created wallet and a WhatsApp invite — turning every transfer into an acquisition event. Daily limits enforced. Atomic debit/credit in a single DB transaction.</w:t>
+      </w:r>
+    </w:p>
+    <w:p>
+      <w:pPr>
+        <w:pStyle w:val="ListParagraph"/>
+        <w:numPr>
+          <w:ilvl w:val="0"/>
+          <w:numId w:val="1"/>
+        </w:numPr>
+        <w:spacing w:after="120"/>
+      </w:pPr>
+      <w:r>
+        <w:rPr>
+          <w:b/>
+          <w:bCs/>
+          <w:sz w:val="22"/>
+          <w:szCs w:val="22"/>
+        </w:rPr>
+        <w:t xml:space="preserve">KYC — Nivel 2 identity verification: CURP-based verification flow against RENAPO. Verified users unlock a $24,000 MXN/month wallet limit (vs. $6,000 unverified). Architected for Metamap/Truora API plug-in; direct RENAPO access available post-SAT entity registration for lower cost at scale.</w:t>
+      </w:r>
+    </w:p>
+    <w:p>
+      <w:pPr>
         <w:spacing w:after="120" w:before="200"/>
       </w:pPr>
       <w:r>
@@ -329,36 +367,6 @@
           <w:sz w:val="22"/>
           <w:szCs w:val="22"/>
         </w:rPr>
-        <w:t>KYC — Nivel 2 identity verification: CURP-based verification flow against RENAPO. Verified users unlock a $24,000 MXN/month wallet limit (vs. $6,000 unverified). Architected for Metamap/Truora API plug-in; direct RENAPO access available post-SAT entity registration for lower cost at scale.</w:t>
-      </w:r>
-    </w:p>
-    <w:p>
-      <w:pPr>
-        <w:spacing w:after="120" w:before="200"/>
-      </w:pPr>
-      <w:r>
-        <w:rPr>
-          <w:b/>
-          <w:bCs/>
-          <w:color w:val="0A2540"/>
-          <w:sz w:val="22"/>
-          <w:szCs w:val="22"/>
-        </w:rPr>
-        <w:t>P2P wallet transfers: Users send MXN directly to any Mexican mobile number. Recipients without an account get an auto-created wallet and a WhatsApp invite — turning every transfer into an acquisition event. Daily limits enforced. Atomic debit/credit in a single DB transaction.</w:t>
-      </w:r>
-    </w:p>
-    <w:p>
-      <w:pPr>
-        <w:spacing w:after="120" w:before="200"/>
-      </w:pPr>
-      <w:r>
-        <w:rPr>
-          <w:b/>
-          <w:bCs/>
-          <w:color w:val="0A2540"/>
-          <w:sz w:val="22"/>
-          <w:szCs w:val="22"/>
-        </w:rPr>
         <w:t xml:space="preserve">What is in progress:</w:t>
       </w:r>
     </w:p>
@@ -395,16 +403,6 @@
         </w:rPr>
         <w:t xml:space="preserve">Scheduled recurring payments (auto-pay for monthly bills)</w:t>
       </w:r>
-    </w:p>
-    <w:p>
-      <w:pPr>
-        <w:pStyle w:val="ListParagraph"/>
-        <w:numPr>
-          <w:ilvl w:val="0"/>
-          <w:numId w:val="1"/>
-        </w:numPr>
-        <w:spacing w:after="100"/>
-      </w:pPr>
     </w:p>
     <w:p>
       <w:pPr>

</xml_diff>